<commit_message>
Update portfolio: add MCS Spatial role, swap training/experience order, rename client references
</commit_message>
<xml_diff>
--- a/resume cv/Varadharajan_A_Tech Resume.docx
+++ b/resume cv/Varadharajan_A_Tech Resume.docx
@@ -105,7 +105,6 @@
         <w:t xml:space="preserve">   |   </w:t>
       </w:r>
       <w:hyperlink r:id="rId7" w:history="1">
-        <w:proofErr w:type="spellStart"/>
         <w:r>
           <w:rPr>
             <w:rFonts w:ascii="Calibri" w:eastAsia="Calibri" w:hAnsi="Calibri" w:cs="Calibri"/>
@@ -117,7 +116,6 @@
           <w:t>Portfolio</w:t>
         </w:r>
       </w:hyperlink>
-      <w:proofErr w:type="spellEnd"/>
     </w:p>
     <w:p>
       <w:pPr>
@@ -211,35 +209,7 @@
           <w:rFonts w:ascii="Calibri" w:eastAsia="Calibri" w:hAnsi="Calibri" w:cs="Calibri"/>
           <w:color w:val="222222"/>
         </w:rPr>
-        <w:t xml:space="preserve">Philippines, Singapore, UAE, Malaysia, Thailand, Indonesia, Nepal, and Jordan, with </w:t>
-      </w:r>
-      <w:r>
-        <w:rPr>
-          <w:rFonts w:ascii="Calibri" w:eastAsia="Calibri" w:hAnsi="Calibri" w:cs="Calibri"/>
-          <w:color w:val="222222"/>
-        </w:rPr>
-        <w:t xml:space="preserve">a </w:t>
-      </w:r>
-      <w:r>
-        <w:rPr>
-          <w:rFonts w:ascii="Calibri" w:eastAsia="Calibri" w:hAnsi="Calibri" w:cs="Calibri"/>
-          <w:color w:val="222222"/>
-        </w:rPr>
-        <w:t xml:space="preserve">96 </w:t>
-      </w:r>
-      <w:r>
-        <w:rPr>
-          <w:rFonts w:ascii="Calibri" w:eastAsia="Calibri" w:hAnsi="Calibri" w:cs="Calibri"/>
-          <w:color w:val="222222"/>
-        </w:rPr>
-        <w:t>per cent</w:t>
-      </w:r>
-      <w:r>
-        <w:rPr>
-          <w:rFonts w:ascii="Calibri" w:eastAsia="Calibri" w:hAnsi="Calibri" w:cs="Calibri"/>
-          <w:color w:val="222222"/>
-        </w:rPr>
-        <w:t xml:space="preserve"> student satisfaction rate and placements. Have skills in Python Full Stack, MERN, Java, DevOps, AI and Machine Learning, and Data Analytics with real-world experience in developing applications for enterprise companies. Currently working on developing an AI-based multi-agent SaaS product for academics using Python, </w:t>
+        <w:t xml:space="preserve">Philippines, Singapore, UAE, Malaysia, Thailand, Indonesia, Nepal, and Jordan, with a 96 per cent student satisfaction rate and placements. Have skills in Python Full Stack, MERN, Java, DevOps, AI and Machine Learning, and Data Analytics with real-world experience in developing applications for enterprise companies. Currently working on developing an AI-based multi-agent SaaS product for academics using Python, </w:t>
       </w:r>
       <w:proofErr w:type="spellStart"/>
       <w:r>
@@ -977,11 +947,6 @@
         </w:tabs>
         <w:jc w:val="both"/>
         <w:rPr>
-          <w:rFonts w:ascii="Calibri" w:hAnsi="Calibri" w:cs="Calibri"/>
-        </w:rPr>
-      </w:pPr>
-      <w:r>
-        <w:rPr>
           <w:rFonts w:ascii="Calibri" w:eastAsia="Calibri" w:hAnsi="Calibri" w:cs="Calibri"/>
           <w:b/>
           <w:bCs/>
@@ -989,9 +954,7 @@
           <w:sz w:val="21"/>
           <w:szCs w:val="21"/>
         </w:rPr>
-        <w:t xml:space="preserve">Technical Master </w:t>
-      </w:r>
-      <w:proofErr w:type="gramStart"/>
+      </w:pPr>
       <w:r>
         <w:rPr>
           <w:rFonts w:ascii="Calibri" w:eastAsia="Calibri" w:hAnsi="Calibri" w:cs="Calibri"/>
@@ -1001,18 +964,19 @@
           <w:sz w:val="21"/>
           <w:szCs w:val="21"/>
         </w:rPr>
-        <w:t>Trainer</w:t>
-      </w:r>
-      <w:r>
-        <w:rPr>
-          <w:rFonts w:ascii="Calibri" w:eastAsia="Calibri" w:hAnsi="Calibri" w:cs="Calibri"/>
-          <w:color w:val="1F3864"/>
+        <w:t>Director – International Training</w:t>
+      </w:r>
+      <w:r>
+        <w:rPr>
+          <w:rFonts w:ascii="Calibri" w:eastAsia="Calibri" w:hAnsi="Calibri" w:cs="Calibri"/>
+          <w:b/>
+          <w:bCs/>
+          <w:color w:val="222222"/>
           <w:sz w:val="21"/>
           <w:szCs w:val="21"/>
         </w:rPr>
-        <w:t xml:space="preserve">  |</w:t>
-      </w:r>
-      <w:proofErr w:type="gramEnd"/>
+        <w:t xml:space="preserve"> | </w:t>
+      </w:r>
       <w:r>
         <w:rPr>
           <w:rFonts w:ascii="Calibri" w:eastAsia="Calibri" w:hAnsi="Calibri" w:cs="Calibri"/>
@@ -1020,27 +984,19 @@
           <w:sz w:val="21"/>
           <w:szCs w:val="21"/>
         </w:rPr>
-        <w:t xml:space="preserve">  </w:t>
-      </w:r>
-      <w:proofErr w:type="spellStart"/>
-      <w:r>
-        <w:rPr>
-          <w:rFonts w:ascii="Calibri" w:eastAsia="Calibri" w:hAnsi="Calibri" w:cs="Calibri"/>
-          <w:color w:val="1F3864"/>
+        <w:t>MCS Spatial</w:t>
+      </w:r>
+      <w:r>
+        <w:rPr>
+          <w:rFonts w:ascii="Calibri" w:eastAsia="Calibri" w:hAnsi="Calibri" w:cs="Calibri"/>
+          <w:b/>
+          <w:bCs/>
+          <w:color w:val="222222"/>
           <w:sz w:val="21"/>
           <w:szCs w:val="21"/>
         </w:rPr>
-        <w:t>Edunet</w:t>
-      </w:r>
-      <w:proofErr w:type="spellEnd"/>
-      <w:r>
-        <w:rPr>
-          <w:rFonts w:ascii="Calibri" w:eastAsia="Calibri" w:hAnsi="Calibri" w:cs="Calibri"/>
-          <w:color w:val="1F3864"/>
-          <w:sz w:val="21"/>
-          <w:szCs w:val="21"/>
-        </w:rPr>
-        <w:t xml:space="preserve"> Foundation</w:t>
+        <w:tab/>
+        <w:t xml:space="preserve">                                    </w:t>
       </w:r>
       <w:r>
         <w:rPr>
@@ -1051,8 +1007,9 @@
           <w:sz w:val="19"/>
           <w:szCs w:val="19"/>
         </w:rPr>
-        <w:tab/>
-      </w:r>
+        <w:t xml:space="preserve">Jun 2026 - Present · 3 </w:t>
+      </w:r>
+      <w:proofErr w:type="spellStart"/>
       <w:r>
         <w:rPr>
           <w:rFonts w:ascii="Calibri" w:eastAsia="Calibri" w:hAnsi="Calibri" w:cs="Calibri"/>
@@ -1062,7 +1019,149 @@
           <w:sz w:val="19"/>
           <w:szCs w:val="19"/>
         </w:rPr>
-        <w:t xml:space="preserve">      </w:t>
+        <w:t>mos</w:t>
+      </w:r>
+      <w:proofErr w:type="spellEnd"/>
+    </w:p>
+    <w:p>
+      <w:pPr>
+        <w:pStyle w:val="ListParagraph"/>
+        <w:numPr>
+          <w:ilvl w:val="0"/>
+          <w:numId w:val="3"/>
+        </w:numPr>
+        <w:tabs>
+          <w:tab w:val="right" w:pos="9350"/>
+        </w:tabs>
+        <w:jc w:val="both"/>
+        <w:rPr>
+          <w:rFonts w:ascii="Calibri" w:eastAsia="Calibri" w:hAnsi="Calibri" w:cs="Calibri"/>
+          <w:color w:val="222222"/>
+        </w:rPr>
+      </w:pPr>
+      <w:r>
+        <w:rPr>
+          <w:rFonts w:ascii="Calibri" w:eastAsia="Calibri" w:hAnsi="Calibri" w:cs="Calibri"/>
+          <w:color w:val="222222"/>
+        </w:rPr>
+        <w:t xml:space="preserve">Building international university partnerships, </w:t>
+      </w:r>
+      <w:r>
+        <w:rPr>
+          <w:rFonts w:ascii="Calibri" w:eastAsia="Calibri" w:hAnsi="Calibri" w:cs="Calibri"/>
+          <w:color w:val="222222"/>
+        </w:rPr>
+        <w:t>designing</w:t>
+      </w:r>
+      <w:r>
+        <w:rPr>
+          <w:rFonts w:ascii="Calibri" w:eastAsia="Calibri" w:hAnsi="Calibri" w:cs="Calibri"/>
+          <w:color w:val="222222"/>
+        </w:rPr>
+        <w:t xml:space="preserve"> global training strategy, Developing Certification Programs, </w:t>
+      </w:r>
+      <w:r>
+        <w:rPr>
+          <w:rFonts w:ascii="Calibri" w:eastAsia="Calibri" w:hAnsi="Calibri" w:cs="Calibri"/>
+          <w:color w:val="222222"/>
+        </w:rPr>
+        <w:t>expanding</w:t>
+      </w:r>
+      <w:r>
+        <w:rPr>
+          <w:rFonts w:ascii="Calibri" w:eastAsia="Calibri" w:hAnsi="Calibri" w:cs="Calibri"/>
+          <w:color w:val="222222"/>
+        </w:rPr>
+        <w:t xml:space="preserve"> training operations into ASEAN, the Middle East, and Africa</w:t>
+      </w:r>
+    </w:p>
+    <w:p>
+      <w:pPr>
+        <w:tabs>
+          <w:tab w:val="right" w:pos="9350"/>
+        </w:tabs>
+        <w:jc w:val="both"/>
+        <w:rPr>
+          <w:rFonts w:ascii="Calibri" w:eastAsia="Calibri" w:hAnsi="Calibri" w:cs="Calibri"/>
+          <w:b/>
+          <w:bCs/>
+          <w:color w:val="222222"/>
+          <w:sz w:val="21"/>
+          <w:szCs w:val="21"/>
+        </w:rPr>
+      </w:pPr>
+    </w:p>
+    <w:p>
+      <w:pPr>
+        <w:tabs>
+          <w:tab w:val="right" w:pos="9350"/>
+        </w:tabs>
+        <w:jc w:val="both"/>
+        <w:rPr>
+          <w:rFonts w:ascii="Calibri" w:hAnsi="Calibri" w:cs="Calibri"/>
+        </w:rPr>
+      </w:pPr>
+      <w:r>
+        <w:rPr>
+          <w:rFonts w:ascii="Calibri" w:eastAsia="Calibri" w:hAnsi="Calibri" w:cs="Calibri"/>
+          <w:b/>
+          <w:bCs/>
+          <w:color w:val="222222"/>
+          <w:sz w:val="21"/>
+          <w:szCs w:val="21"/>
+        </w:rPr>
+        <w:t xml:space="preserve">Technical Master </w:t>
+      </w:r>
+      <w:proofErr w:type="gramStart"/>
+      <w:r>
+        <w:rPr>
+          <w:rFonts w:ascii="Calibri" w:eastAsia="Calibri" w:hAnsi="Calibri" w:cs="Calibri"/>
+          <w:b/>
+          <w:bCs/>
+          <w:color w:val="222222"/>
+          <w:sz w:val="21"/>
+          <w:szCs w:val="21"/>
+        </w:rPr>
+        <w:t>Trainer</w:t>
+      </w:r>
+      <w:r>
+        <w:rPr>
+          <w:rFonts w:ascii="Calibri" w:eastAsia="Calibri" w:hAnsi="Calibri" w:cs="Calibri"/>
+          <w:color w:val="1F3864"/>
+          <w:sz w:val="21"/>
+          <w:szCs w:val="21"/>
+        </w:rPr>
+        <w:t xml:space="preserve">  |</w:t>
+      </w:r>
+      <w:proofErr w:type="gramEnd"/>
+      <w:r>
+        <w:rPr>
+          <w:rFonts w:ascii="Calibri" w:eastAsia="Calibri" w:hAnsi="Calibri" w:cs="Calibri"/>
+          <w:color w:val="1F3864"/>
+          <w:sz w:val="21"/>
+          <w:szCs w:val="21"/>
+        </w:rPr>
+        <w:t xml:space="preserve">  </w:t>
+      </w:r>
+      <w:proofErr w:type="spellStart"/>
+      <w:r>
+        <w:rPr>
+          <w:rFonts w:ascii="Calibri" w:eastAsia="Calibri" w:hAnsi="Calibri" w:cs="Calibri"/>
+          <w:color w:val="1F3864"/>
+          <w:sz w:val="21"/>
+          <w:szCs w:val="21"/>
+        </w:rPr>
+        <w:t>Edunet</w:t>
+      </w:r>
+      <w:proofErr w:type="spellEnd"/>
+      <w:r>
+        <w:rPr>
+          <w:rFonts w:ascii="Calibri" w:eastAsia="Calibri" w:hAnsi="Calibri" w:cs="Calibri"/>
+          <w:color w:val="1F3864"/>
+          <w:sz w:val="21"/>
+          <w:szCs w:val="21"/>
+        </w:rPr>
+        <w:t xml:space="preserve"> Foundation</w:t>
       </w:r>
       <w:r>
         <w:rPr>
@@ -1073,162 +1172,7 @@
           <w:sz w:val="19"/>
           <w:szCs w:val="19"/>
         </w:rPr>
-        <w:t>Nov 2023 - May 2026</w:t>
-      </w:r>
-    </w:p>
-    <w:p>
-      <w:pPr>
-        <w:pStyle w:val="ListParagraph"/>
-        <w:numPr>
-          <w:ilvl w:val="0"/>
-          <w:numId w:val="2"/>
-        </w:numPr>
-        <w:jc w:val="both"/>
-        <w:rPr>
-          <w:rFonts w:ascii="Calibri" w:hAnsi="Calibri" w:cs="Calibri"/>
-        </w:rPr>
-      </w:pPr>
-      <w:r>
-        <w:rPr>
-          <w:rFonts w:ascii="Calibri" w:eastAsia="Calibri" w:hAnsi="Calibri" w:cs="Calibri"/>
-          <w:color w:val="222222"/>
-        </w:rPr>
-        <w:t>Delivered technical training under corporate CSR-funded programs</w:t>
-      </w:r>
-      <w:r>
-        <w:rPr>
-          <w:rFonts w:ascii="Calibri" w:eastAsia="Calibri" w:hAnsi="Calibri" w:cs="Calibri"/>
-          <w:color w:val="222222"/>
-        </w:rPr>
-        <w:t>,</w:t>
-      </w:r>
-      <w:r>
-        <w:rPr>
-          <w:rFonts w:ascii="Calibri" w:eastAsia="Calibri" w:hAnsi="Calibri" w:cs="Calibri"/>
-          <w:color w:val="222222"/>
-        </w:rPr>
-        <w:t xml:space="preserve"> including EY Skills, VOIS, IBM Skills, Nan </w:t>
-      </w:r>
-      <w:proofErr w:type="spellStart"/>
-      <w:r>
-        <w:rPr>
-          <w:rFonts w:ascii="Calibri" w:eastAsia="Calibri" w:hAnsi="Calibri" w:cs="Calibri"/>
-          <w:color w:val="222222"/>
-        </w:rPr>
-        <w:t>Mudhalvan</w:t>
-      </w:r>
-      <w:proofErr w:type="spellEnd"/>
-      <w:r>
-        <w:rPr>
-          <w:rFonts w:ascii="Calibri" w:eastAsia="Calibri" w:hAnsi="Calibri" w:cs="Calibri"/>
-          <w:color w:val="222222"/>
-        </w:rPr>
-        <w:t>, Youth Employability, and AICTE Internship initiatives.</w:t>
-      </w:r>
-    </w:p>
-    <w:p>
-      <w:pPr>
-        <w:pStyle w:val="ListParagraph"/>
-        <w:numPr>
-          <w:ilvl w:val="0"/>
-          <w:numId w:val="2"/>
-        </w:numPr>
-        <w:jc w:val="both"/>
-        <w:rPr>
-          <w:rFonts w:ascii="Calibri" w:hAnsi="Calibri" w:cs="Calibri"/>
-        </w:rPr>
-      </w:pPr>
-      <w:r>
-        <w:rPr>
-          <w:rFonts w:ascii="Calibri" w:eastAsia="Calibri" w:hAnsi="Calibri" w:cs="Calibri"/>
-          <w:color w:val="222222"/>
-        </w:rPr>
-        <w:t>Trained learners in Cloud (MS Azure, Render), Python Full Stack with AI, MERN Full Stack, DevOps, and database technologies (MySQL, Oracle, MS SQL Server, MongoDB, PostgreSQL).</w:t>
-      </w:r>
-    </w:p>
-    <w:p>
-      <w:pPr>
-        <w:pStyle w:val="ListParagraph"/>
-        <w:numPr>
-          <w:ilvl w:val="0"/>
-          <w:numId w:val="2"/>
-        </w:numPr>
-        <w:jc w:val="both"/>
-        <w:rPr>
-          <w:rFonts w:ascii="Calibri" w:hAnsi="Calibri" w:cs="Calibri"/>
-        </w:rPr>
-      </w:pPr>
-      <w:r>
-        <w:rPr>
-          <w:rFonts w:ascii="Calibri" w:eastAsia="Calibri" w:hAnsi="Calibri" w:cs="Calibri"/>
-          <w:color w:val="222222"/>
-        </w:rPr>
-        <w:t>Delivered a 2-day Faculty Development Programme on Generative AI in Higher Education, producing full production-ready training materials across five topics</w:t>
-      </w:r>
-      <w:r>
-        <w:rPr>
-          <w:rFonts w:ascii="Calibri" w:eastAsia="Calibri" w:hAnsi="Calibri" w:cs="Calibri"/>
-          <w:color w:val="222222"/>
-        </w:rPr>
-        <w:t>,</w:t>
-      </w:r>
-      <w:r>
-        <w:rPr>
-          <w:rFonts w:ascii="Calibri" w:eastAsia="Calibri" w:hAnsi="Calibri" w:cs="Calibri"/>
-          <w:color w:val="222222"/>
-        </w:rPr>
-        <w:t xml:space="preserve"> including prompt engineering, AI for research, and AI agents.</w:t>
-      </w:r>
-    </w:p>
-    <w:p>
-      <w:pPr>
-        <w:tabs>
-          <w:tab w:val="right" w:pos="9350"/>
-        </w:tabs>
-        <w:jc w:val="both"/>
-        <w:rPr>
-          <w:rFonts w:ascii="Calibri" w:hAnsi="Calibri" w:cs="Calibri"/>
-        </w:rPr>
-      </w:pPr>
-      <w:r>
-        <w:rPr>
-          <w:rFonts w:ascii="Calibri" w:eastAsia="Calibri" w:hAnsi="Calibri" w:cs="Calibri"/>
-          <w:b/>
-          <w:bCs/>
-          <w:color w:val="222222"/>
-          <w:sz w:val="21"/>
-          <w:szCs w:val="21"/>
-        </w:rPr>
-        <w:t>Master Trainer</w:t>
-      </w:r>
-      <w:r>
-        <w:rPr>
-          <w:rFonts w:ascii="Calibri" w:eastAsia="Calibri" w:hAnsi="Calibri" w:cs="Calibri"/>
-          <w:color w:val="1F3864"/>
-          <w:sz w:val="21"/>
-          <w:szCs w:val="21"/>
-        </w:rPr>
-        <w:t xml:space="preserve"> | </w:t>
-      </w:r>
-      <w:proofErr w:type="spellStart"/>
-      <w:r>
-        <w:rPr>
-          <w:rFonts w:ascii="Calibri" w:eastAsia="Calibri" w:hAnsi="Calibri" w:cs="Calibri"/>
-          <w:color w:val="1F3864"/>
-          <w:sz w:val="21"/>
-          <w:szCs w:val="21"/>
-        </w:rPr>
-        <w:t>EduBridge</w:t>
-      </w:r>
-      <w:proofErr w:type="spellEnd"/>
-      <w:r>
-        <w:rPr>
-          <w:rFonts w:ascii="Calibri" w:eastAsia="Calibri" w:hAnsi="Calibri" w:cs="Calibri"/>
-          <w:color w:val="1F3864"/>
-          <w:sz w:val="21"/>
-          <w:szCs w:val="21"/>
-        </w:rPr>
-        <w:t xml:space="preserve"> Learning, Mumbai</w:t>
+        <w:tab/>
       </w:r>
       <w:r>
         <w:rPr>
@@ -1239,99 +1183,7 @@
           <w:sz w:val="19"/>
           <w:szCs w:val="19"/>
         </w:rPr>
-        <w:tab/>
-        <w:t>Feb 2022 - Oct 2023</w:t>
-      </w:r>
-    </w:p>
-    <w:p>
-      <w:pPr>
-        <w:pStyle w:val="ListParagraph"/>
-        <w:numPr>
-          <w:ilvl w:val="0"/>
-          <w:numId w:val="2"/>
-        </w:numPr>
-        <w:jc w:val="both"/>
-        <w:rPr>
-          <w:rFonts w:ascii="Calibri" w:hAnsi="Calibri" w:cs="Calibri"/>
-        </w:rPr>
-      </w:pPr>
-      <w:r>
-        <w:rPr>
-          <w:rFonts w:ascii="Calibri" w:eastAsia="Calibri" w:hAnsi="Calibri" w:cs="Calibri"/>
-          <w:color w:val="222222"/>
-        </w:rPr>
-        <w:t>Delivered Java Full Stack and MERN Full Stack training under Capgemini Digital Academy Program, Infosys Employability Program, Women in Tech Program, and Career Readiness Program.</w:t>
-      </w:r>
-    </w:p>
-    <w:p>
-      <w:pPr>
-        <w:pStyle w:val="ListParagraph"/>
-        <w:numPr>
-          <w:ilvl w:val="0"/>
-          <w:numId w:val="2"/>
-        </w:numPr>
-        <w:jc w:val="both"/>
-        <w:rPr>
-          <w:rFonts w:ascii="Calibri" w:hAnsi="Calibri" w:cs="Calibri"/>
-        </w:rPr>
-      </w:pPr>
-      <w:r>
-        <w:rPr>
-          <w:rFonts w:ascii="Calibri" w:eastAsia="Calibri" w:hAnsi="Calibri" w:cs="Calibri"/>
-          <w:color w:val="222222"/>
-        </w:rPr>
-        <w:t>Led comprehensive curriculum delivery and mentoring for CSR-funded workforce development projects.</w:t>
-      </w:r>
-    </w:p>
-    <w:p>
-      <w:pPr>
-        <w:tabs>
-          <w:tab w:val="right" w:pos="9350"/>
-        </w:tabs>
-        <w:jc w:val="both"/>
-        <w:rPr>
-          <w:rFonts w:ascii="Calibri" w:hAnsi="Calibri" w:cs="Calibri"/>
-        </w:rPr>
-      </w:pPr>
-      <w:r>
-        <w:rPr>
-          <w:rFonts w:ascii="Calibri" w:eastAsia="Calibri" w:hAnsi="Calibri" w:cs="Calibri"/>
-          <w:b/>
-          <w:bCs/>
-          <w:color w:val="222222"/>
-          <w:sz w:val="21"/>
-          <w:szCs w:val="21"/>
-        </w:rPr>
-        <w:t>Corporate Trainer (Freelancer)</w:t>
-      </w:r>
-      <w:r>
-        <w:rPr>
-          <w:rFonts w:ascii="Calibri" w:eastAsia="Calibri" w:hAnsi="Calibri" w:cs="Calibri"/>
-          <w:color w:val="1F3864"/>
-          <w:sz w:val="21"/>
-          <w:szCs w:val="21"/>
-        </w:rPr>
-        <w:t xml:space="preserve"> | Infosys, Bangalore / </w:t>
-      </w:r>
-      <w:proofErr w:type="spellStart"/>
-      <w:r>
-        <w:rPr>
-          <w:rFonts w:ascii="Calibri" w:eastAsia="Calibri" w:hAnsi="Calibri" w:cs="Calibri"/>
-          <w:color w:val="1F3864"/>
-          <w:sz w:val="21"/>
-          <w:szCs w:val="21"/>
-        </w:rPr>
-        <w:t>Matrixx</w:t>
-      </w:r>
-      <w:proofErr w:type="spellEnd"/>
-      <w:r>
-        <w:rPr>
-          <w:rFonts w:ascii="Calibri" w:eastAsia="Calibri" w:hAnsi="Calibri" w:cs="Calibri"/>
-          <w:color w:val="1F3864"/>
-          <w:sz w:val="21"/>
-          <w:szCs w:val="21"/>
-        </w:rPr>
-        <w:t xml:space="preserve"> / Siemens Technology India</w:t>
+        <w:t xml:space="preserve">      </w:t>
       </w:r>
       <w:r>
         <w:rPr>
@@ -1342,49 +1194,41 @@
           <w:sz w:val="19"/>
           <w:szCs w:val="19"/>
         </w:rPr>
-        <w:tab/>
-        <w:t>2021 - 2024</w:t>
-      </w:r>
-    </w:p>
-    <w:p>
-      <w:pPr>
-        <w:pStyle w:val="ListParagraph"/>
-        <w:numPr>
-          <w:ilvl w:val="0"/>
-          <w:numId w:val="2"/>
-        </w:numPr>
-        <w:jc w:val="both"/>
-        <w:rPr>
-          <w:rFonts w:ascii="Calibri" w:hAnsi="Calibri" w:cs="Calibri"/>
-        </w:rPr>
-      </w:pPr>
-      <w:r>
-        <w:rPr>
-          <w:rFonts w:ascii="Calibri" w:eastAsia="Calibri" w:hAnsi="Calibri" w:cs="Calibri"/>
-          <w:color w:val="222222"/>
-        </w:rPr>
-        <w:t>Delivered a 10-day program on Render Cloud Platform, DevOps monitoring with PM2, and CI/CD with Git and GitHub for Infosys.</w:t>
-      </w:r>
-    </w:p>
-    <w:p>
-      <w:pPr>
-        <w:pStyle w:val="ListParagraph"/>
-        <w:numPr>
-          <w:ilvl w:val="0"/>
-          <w:numId w:val="2"/>
-        </w:numPr>
-        <w:jc w:val="both"/>
-        <w:rPr>
-          <w:rFonts w:ascii="Calibri" w:hAnsi="Calibri" w:cs="Calibri"/>
-        </w:rPr>
-      </w:pPr>
-      <w:r>
-        <w:rPr>
-          <w:rFonts w:ascii="Calibri" w:eastAsia="Calibri" w:hAnsi="Calibri" w:cs="Calibri"/>
-          <w:color w:val="222222"/>
-        </w:rPr>
-        <w:lastRenderedPageBreak/>
-        <w:t xml:space="preserve">Delivered an 8-day </w:t>
+        <w:t>Nov 2023 - May 2026</w:t>
+      </w:r>
+    </w:p>
+    <w:p>
+      <w:pPr>
+        <w:pStyle w:val="ListParagraph"/>
+        <w:numPr>
+          <w:ilvl w:val="0"/>
+          <w:numId w:val="2"/>
+        </w:numPr>
+        <w:jc w:val="both"/>
+        <w:rPr>
+          <w:rFonts w:ascii="Calibri" w:hAnsi="Calibri" w:cs="Calibri"/>
+        </w:rPr>
+      </w:pPr>
+      <w:r>
+        <w:rPr>
+          <w:rFonts w:ascii="Calibri" w:eastAsia="Calibri" w:hAnsi="Calibri" w:cs="Calibri"/>
+          <w:color w:val="222222"/>
+        </w:rPr>
+        <w:t>Delivered technical training under corporate CSR-funded programs</w:t>
+      </w:r>
+      <w:r>
+        <w:rPr>
+          <w:rFonts w:ascii="Calibri" w:eastAsia="Calibri" w:hAnsi="Calibri" w:cs="Calibri"/>
+          <w:color w:val="222222"/>
+        </w:rPr>
+        <w:t>,</w:t>
+      </w:r>
+      <w:r>
+        <w:rPr>
+          <w:rFonts w:ascii="Calibri" w:eastAsia="Calibri" w:hAnsi="Calibri" w:cs="Calibri"/>
+          <w:color w:val="222222"/>
+        </w:rPr>
+        <w:t xml:space="preserve"> including EY Skills, VOIS, IBM Skills, Nan </w:t>
       </w:r>
       <w:proofErr w:type="spellStart"/>
       <w:r>
@@ -1392,7 +1236,7 @@
           <w:rFonts w:ascii="Calibri" w:eastAsia="Calibri" w:hAnsi="Calibri" w:cs="Calibri"/>
           <w:color w:val="222222"/>
         </w:rPr>
-        <w:t>Matrixx</w:t>
+        <w:t>Mudhalvan</w:t>
       </w:r>
       <w:proofErr w:type="spellEnd"/>
       <w:r>
@@ -1400,27 +1244,61 @@
           <w:rFonts w:ascii="Calibri" w:eastAsia="Calibri" w:hAnsi="Calibri" w:cs="Calibri"/>
           <w:color w:val="222222"/>
         </w:rPr>
-        <w:t xml:space="preserve"> Foundation program covering DevOps integration, monitoring and observability, and real-time industry use cases.</w:t>
-      </w:r>
-    </w:p>
-    <w:p>
-      <w:pPr>
-        <w:pStyle w:val="ListParagraph"/>
-        <w:numPr>
-          <w:ilvl w:val="0"/>
-          <w:numId w:val="2"/>
-        </w:numPr>
-        <w:jc w:val="both"/>
-        <w:rPr>
-          <w:rFonts w:ascii="Calibri" w:hAnsi="Calibri" w:cs="Calibri"/>
-        </w:rPr>
-      </w:pPr>
-      <w:r>
-        <w:rPr>
-          <w:rFonts w:ascii="Calibri" w:eastAsia="Calibri" w:hAnsi="Calibri" w:cs="Calibri"/>
-          <w:color w:val="222222"/>
-        </w:rPr>
-        <w:t>Delivered a 33-day AngularJS and testing concepts program for professional engineers at Siemens Technology India.</w:t>
+        <w:t>, Youth Employability, and AICTE Internship initiatives.</w:t>
+      </w:r>
+    </w:p>
+    <w:p>
+      <w:pPr>
+        <w:pStyle w:val="ListParagraph"/>
+        <w:numPr>
+          <w:ilvl w:val="0"/>
+          <w:numId w:val="2"/>
+        </w:numPr>
+        <w:jc w:val="both"/>
+        <w:rPr>
+          <w:rFonts w:ascii="Calibri" w:hAnsi="Calibri" w:cs="Calibri"/>
+        </w:rPr>
+      </w:pPr>
+      <w:r>
+        <w:rPr>
+          <w:rFonts w:ascii="Calibri" w:eastAsia="Calibri" w:hAnsi="Calibri" w:cs="Calibri"/>
+          <w:color w:val="222222"/>
+        </w:rPr>
+        <w:t>Trained learners in Cloud (MS Azure, Render), Python Full Stack with AI, MERN Full Stack, DevOps, and database technologies (MySQL, Oracle, MS SQL Server, MongoDB, PostgreSQL).</w:t>
+      </w:r>
+    </w:p>
+    <w:p>
+      <w:pPr>
+        <w:pStyle w:val="ListParagraph"/>
+        <w:numPr>
+          <w:ilvl w:val="0"/>
+          <w:numId w:val="2"/>
+        </w:numPr>
+        <w:jc w:val="both"/>
+        <w:rPr>
+          <w:rFonts w:ascii="Calibri" w:hAnsi="Calibri" w:cs="Calibri"/>
+        </w:rPr>
+      </w:pPr>
+      <w:r>
+        <w:rPr>
+          <w:rFonts w:ascii="Calibri" w:eastAsia="Calibri" w:hAnsi="Calibri" w:cs="Calibri"/>
+          <w:color w:val="222222"/>
+        </w:rPr>
+        <w:t>Delivered a 2-day Faculty Development Programme on Generative AI in Higher Education, producing full production-ready training materials across five topics</w:t>
+      </w:r>
+      <w:r>
+        <w:rPr>
+          <w:rFonts w:ascii="Calibri" w:eastAsia="Calibri" w:hAnsi="Calibri" w:cs="Calibri"/>
+          <w:color w:val="222222"/>
+        </w:rPr>
+        <w:t>,</w:t>
+      </w:r>
+      <w:r>
+        <w:rPr>
+          <w:rFonts w:ascii="Calibri" w:eastAsia="Calibri" w:hAnsi="Calibri" w:cs="Calibri"/>
+          <w:color w:val="222222"/>
+        </w:rPr>
+        <w:t xml:space="preserve"> including prompt engineering, AI for research, and AI agents.</w:t>
       </w:r>
     </w:p>
     <w:p>
@@ -1430,11 +1308,6 @@
         </w:tabs>
         <w:jc w:val="both"/>
         <w:rPr>
-          <w:rFonts w:ascii="Calibri" w:hAnsi="Calibri" w:cs="Calibri"/>
-        </w:rPr>
-      </w:pPr>
-      <w:r>
-        <w:rPr>
           <w:rFonts w:ascii="Calibri" w:eastAsia="Calibri" w:hAnsi="Calibri" w:cs="Calibri"/>
           <w:b/>
           <w:bCs/>
@@ -1442,16 +1315,57 @@
           <w:sz w:val="21"/>
           <w:szCs w:val="21"/>
         </w:rPr>
-        <w:t>Online Corporate Trainer (Freelancer)</w:t>
-      </w:r>
-      <w:r>
-        <w:rPr>
-          <w:rFonts w:ascii="Calibri" w:eastAsia="Calibri" w:hAnsi="Calibri" w:cs="Calibri"/>
-          <w:color w:val="1F3864"/>
+      </w:pPr>
+    </w:p>
+    <w:p>
+      <w:pPr>
+        <w:tabs>
+          <w:tab w:val="right" w:pos="9350"/>
+        </w:tabs>
+        <w:jc w:val="both"/>
+        <w:rPr>
+          <w:rFonts w:ascii="Calibri" w:hAnsi="Calibri" w:cs="Calibri"/>
+        </w:rPr>
+      </w:pPr>
+      <w:r>
+        <w:rPr>
+          <w:rFonts w:ascii="Calibri" w:eastAsia="Calibri" w:hAnsi="Calibri" w:cs="Calibri"/>
+          <w:b/>
+          <w:bCs/>
+          <w:color w:val="222222"/>
           <w:sz w:val="21"/>
           <w:szCs w:val="21"/>
         </w:rPr>
-        <w:t xml:space="preserve"> | Job Seekers - Jordan, USA, India / Amazon</w:t>
+        <w:t>Master Trainer</w:t>
+      </w:r>
+      <w:r>
+        <w:rPr>
+          <w:rFonts w:ascii="Calibri" w:eastAsia="Calibri" w:hAnsi="Calibri" w:cs="Calibri"/>
+          <w:color w:val="1F3864"/>
+          <w:sz w:val="21"/>
+          <w:szCs w:val="21"/>
+        </w:rPr>
+        <w:t xml:space="preserve"> | </w:t>
+      </w:r>
+      <w:proofErr w:type="spellStart"/>
+      <w:r>
+        <w:rPr>
+          <w:rFonts w:ascii="Calibri" w:eastAsia="Calibri" w:hAnsi="Calibri" w:cs="Calibri"/>
+          <w:color w:val="1F3864"/>
+          <w:sz w:val="21"/>
+          <w:szCs w:val="21"/>
+        </w:rPr>
+        <w:t>EduBridge</w:t>
+      </w:r>
+      <w:proofErr w:type="spellEnd"/>
+      <w:r>
+        <w:rPr>
+          <w:rFonts w:ascii="Calibri" w:eastAsia="Calibri" w:hAnsi="Calibri" w:cs="Calibri"/>
+          <w:color w:val="1F3864"/>
+          <w:sz w:val="21"/>
+          <w:szCs w:val="21"/>
+        </w:rPr>
+        <w:t xml:space="preserve"> Learning, Mumbai</w:t>
       </w:r>
       <w:r>
         <w:rPr>
@@ -1463,47 +1377,47 @@
           <w:szCs w:val="19"/>
         </w:rPr>
         <w:tab/>
-        <w:t>Mar 2020 - Mar 2021</w:t>
-      </w:r>
-    </w:p>
-    <w:p>
-      <w:pPr>
-        <w:pStyle w:val="ListParagraph"/>
-        <w:numPr>
-          <w:ilvl w:val="0"/>
-          <w:numId w:val="2"/>
-        </w:numPr>
-        <w:jc w:val="both"/>
-        <w:rPr>
-          <w:rFonts w:ascii="Calibri" w:hAnsi="Calibri" w:cs="Calibri"/>
-        </w:rPr>
-      </w:pPr>
-      <w:r>
-        <w:rPr>
-          <w:rFonts w:ascii="Calibri" w:eastAsia="Calibri" w:hAnsi="Calibri" w:cs="Calibri"/>
-          <w:color w:val="222222"/>
-        </w:rPr>
-        <w:t>Delivered 8 months of international training in Angular, React, MySQL, Oracle, PostgreSQL, Python, Selenium, Cucumber, and JUnit for global learners.</w:t>
-      </w:r>
-    </w:p>
-    <w:p>
-      <w:pPr>
-        <w:pStyle w:val="ListParagraph"/>
-        <w:numPr>
-          <w:ilvl w:val="0"/>
-          <w:numId w:val="2"/>
-        </w:numPr>
-        <w:jc w:val="both"/>
-        <w:rPr>
-          <w:rFonts w:ascii="Calibri" w:hAnsi="Calibri" w:cs="Calibri"/>
-        </w:rPr>
-      </w:pPr>
-      <w:r>
-        <w:rPr>
-          <w:rFonts w:ascii="Calibri" w:eastAsia="Calibri" w:hAnsi="Calibri" w:cs="Calibri"/>
-          <w:color w:val="222222"/>
-        </w:rPr>
-        <w:t>Trained Amazon software developers in the USA on Java, Selenium, Cucumber, and Mockito over a 45-day engagement.</w:t>
+        <w:t>Feb 2022 - Oct 2023</w:t>
+      </w:r>
+    </w:p>
+    <w:p>
+      <w:pPr>
+        <w:pStyle w:val="ListParagraph"/>
+        <w:numPr>
+          <w:ilvl w:val="0"/>
+          <w:numId w:val="2"/>
+        </w:numPr>
+        <w:jc w:val="both"/>
+        <w:rPr>
+          <w:rFonts w:ascii="Calibri" w:hAnsi="Calibri" w:cs="Calibri"/>
+        </w:rPr>
+      </w:pPr>
+      <w:r>
+        <w:rPr>
+          <w:rFonts w:ascii="Calibri" w:eastAsia="Calibri" w:hAnsi="Calibri" w:cs="Calibri"/>
+          <w:color w:val="222222"/>
+        </w:rPr>
+        <w:t>Delivered Java Full Stack and MERN Full Stack training under Capgemini Digital Academy Program, Infosys Employability Program, Women in Tech Program, and Career Readiness Program.</w:t>
+      </w:r>
+    </w:p>
+    <w:p>
+      <w:pPr>
+        <w:pStyle w:val="ListParagraph"/>
+        <w:numPr>
+          <w:ilvl w:val="0"/>
+          <w:numId w:val="2"/>
+        </w:numPr>
+        <w:jc w:val="both"/>
+        <w:rPr>
+          <w:rFonts w:ascii="Calibri" w:hAnsi="Calibri" w:cs="Calibri"/>
+        </w:rPr>
+      </w:pPr>
+      <w:r>
+        <w:rPr>
+          <w:rFonts w:ascii="Calibri" w:eastAsia="Calibri" w:hAnsi="Calibri" w:cs="Calibri"/>
+          <w:color w:val="222222"/>
+        </w:rPr>
+        <w:t>Led comprehensive curriculum delivery and mentoring for CSR-funded workforce development projects.</w:t>
       </w:r>
     </w:p>
     <w:p>
@@ -1525,7 +1439,8 @@
           <w:sz w:val="21"/>
           <w:szCs w:val="21"/>
         </w:rPr>
-        <w:t>Corporate Trainer</w:t>
+        <w:lastRenderedPageBreak/>
+        <w:t>Corporate Trainer (Freelancer)</w:t>
       </w:r>
       <w:r>
         <w:rPr>
@@ -1534,7 +1449,27 @@
           <w:sz w:val="21"/>
           <w:szCs w:val="21"/>
         </w:rPr>
-        <w:t xml:space="preserve"> | TEC Consultancy Services, Chennai</w:t>
+        <w:t xml:space="preserve"> | Infosys, Bangalore / </w:t>
+      </w:r>
+      <w:proofErr w:type="spellStart"/>
+      <w:r>
+        <w:rPr>
+          <w:rFonts w:ascii="Calibri" w:eastAsia="Calibri" w:hAnsi="Calibri" w:cs="Calibri"/>
+          <w:color w:val="1F3864"/>
+          <w:sz w:val="21"/>
+          <w:szCs w:val="21"/>
+        </w:rPr>
+        <w:t>Matrixx</w:t>
+      </w:r>
+      <w:proofErr w:type="spellEnd"/>
+      <w:r>
+        <w:rPr>
+          <w:rFonts w:ascii="Calibri" w:eastAsia="Calibri" w:hAnsi="Calibri" w:cs="Calibri"/>
+          <w:color w:val="1F3864"/>
+          <w:sz w:val="21"/>
+          <w:szCs w:val="21"/>
+        </w:rPr>
+        <w:t xml:space="preserve"> / Siemens Technology India</w:t>
       </w:r>
       <w:r>
         <w:rPr>
@@ -1546,65 +1481,83 @@
           <w:szCs w:val="19"/>
         </w:rPr>
         <w:tab/>
-        <w:t>Apr 2005 - May 2006</w:t>
-      </w:r>
-    </w:p>
-    <w:p>
-      <w:pPr>
-        <w:pStyle w:val="ListParagraph"/>
-        <w:numPr>
-          <w:ilvl w:val="0"/>
-          <w:numId w:val="2"/>
-        </w:numPr>
-        <w:jc w:val="both"/>
-        <w:rPr>
-          <w:rFonts w:ascii="Calibri" w:hAnsi="Calibri" w:cs="Calibri"/>
-        </w:rPr>
-      </w:pPr>
-      <w:r>
-        <w:rPr>
-          <w:rFonts w:ascii="Calibri" w:eastAsia="Calibri" w:hAnsi="Calibri" w:cs="Calibri"/>
-          <w:color w:val="222222"/>
-        </w:rPr>
-        <w:t>Delivered programming languages, core concepts, and database training across multiple corporate batches over one year.</w:t>
-      </w:r>
-    </w:p>
-    <w:p>
-      <w:pPr>
-        <w:pBdr>
-          <w:bottom w:val="single" w:sz="4" w:space="2" w:color="1F3864"/>
-        </w:pBdr>
-        <w:jc w:val="both"/>
-        <w:rPr>
-          <w:rFonts w:ascii="Calibri" w:eastAsia="Calibri" w:hAnsi="Calibri" w:cs="Calibri"/>
-          <w:b/>
-          <w:bCs/>
-          <w:color w:val="1F3864"/>
-          <w:sz w:val="22"/>
-          <w:szCs w:val="22"/>
-        </w:rPr>
-      </w:pPr>
-    </w:p>
-    <w:p>
-      <w:pPr>
-        <w:pBdr>
-          <w:bottom w:val="single" w:sz="4" w:space="2" w:color="1F3864"/>
-        </w:pBdr>
-        <w:jc w:val="both"/>
-        <w:rPr>
-          <w:rFonts w:ascii="Calibri" w:hAnsi="Calibri" w:cs="Calibri"/>
-        </w:rPr>
-      </w:pPr>
-      <w:r>
-        <w:rPr>
-          <w:rFonts w:ascii="Calibri" w:eastAsia="Calibri" w:hAnsi="Calibri" w:cs="Calibri"/>
-          <w:b/>
-          <w:bCs/>
-          <w:color w:val="1F3864"/>
-          <w:sz w:val="22"/>
-          <w:szCs w:val="22"/>
-        </w:rPr>
-        <w:t>PROFESSIONAL DEVELOPMENT EXPERIENCE</w:t>
+        <w:t>2021 - 2024</w:t>
+      </w:r>
+    </w:p>
+    <w:p>
+      <w:pPr>
+        <w:pStyle w:val="ListParagraph"/>
+        <w:numPr>
+          <w:ilvl w:val="0"/>
+          <w:numId w:val="2"/>
+        </w:numPr>
+        <w:jc w:val="both"/>
+        <w:rPr>
+          <w:rFonts w:ascii="Calibri" w:hAnsi="Calibri" w:cs="Calibri"/>
+        </w:rPr>
+      </w:pPr>
+      <w:r>
+        <w:rPr>
+          <w:rFonts w:ascii="Calibri" w:eastAsia="Calibri" w:hAnsi="Calibri" w:cs="Calibri"/>
+          <w:color w:val="222222"/>
+        </w:rPr>
+        <w:t>Delivered a 10-day program on Render Cloud Platform, DevOps monitoring with PM2, and CI/CD with Git and GitHub for Infosys.</w:t>
+      </w:r>
+    </w:p>
+    <w:p>
+      <w:pPr>
+        <w:pStyle w:val="ListParagraph"/>
+        <w:numPr>
+          <w:ilvl w:val="0"/>
+          <w:numId w:val="2"/>
+        </w:numPr>
+        <w:jc w:val="both"/>
+        <w:rPr>
+          <w:rFonts w:ascii="Calibri" w:hAnsi="Calibri" w:cs="Calibri"/>
+        </w:rPr>
+      </w:pPr>
+      <w:r>
+        <w:rPr>
+          <w:rFonts w:ascii="Calibri" w:eastAsia="Calibri" w:hAnsi="Calibri" w:cs="Calibri"/>
+          <w:color w:val="222222"/>
+        </w:rPr>
+        <w:t xml:space="preserve">Delivered an 8-day </w:t>
+      </w:r>
+      <w:proofErr w:type="spellStart"/>
+      <w:r>
+        <w:rPr>
+          <w:rFonts w:ascii="Calibri" w:eastAsia="Calibri" w:hAnsi="Calibri" w:cs="Calibri"/>
+          <w:color w:val="222222"/>
+        </w:rPr>
+        <w:t>Matrixx</w:t>
+      </w:r>
+      <w:proofErr w:type="spellEnd"/>
+      <w:r>
+        <w:rPr>
+          <w:rFonts w:ascii="Calibri" w:eastAsia="Calibri" w:hAnsi="Calibri" w:cs="Calibri"/>
+          <w:color w:val="222222"/>
+        </w:rPr>
+        <w:t xml:space="preserve"> Foundation program covering DevOps integration, monitoring and observability, and real-time industry use cases.</w:t>
+      </w:r>
+    </w:p>
+    <w:p>
+      <w:pPr>
+        <w:pStyle w:val="ListParagraph"/>
+        <w:numPr>
+          <w:ilvl w:val="0"/>
+          <w:numId w:val="2"/>
+        </w:numPr>
+        <w:jc w:val="both"/>
+        <w:rPr>
+          <w:rFonts w:ascii="Calibri" w:hAnsi="Calibri" w:cs="Calibri"/>
+        </w:rPr>
+      </w:pPr>
+      <w:r>
+        <w:rPr>
+          <w:rFonts w:ascii="Calibri" w:eastAsia="Calibri" w:hAnsi="Calibri" w:cs="Calibri"/>
+          <w:color w:val="222222"/>
+        </w:rPr>
+        <w:t>Delivered a 33-day AngularJS and testing concepts program for professional engineers at Siemens Technology India.</w:t>
       </w:r>
     </w:p>
     <w:p>
@@ -1626,7 +1579,7 @@
           <w:sz w:val="21"/>
           <w:szCs w:val="21"/>
         </w:rPr>
-        <w:t>Senior Java Developer</w:t>
+        <w:t>Online Corporate Trainer (Freelancer)</w:t>
       </w:r>
       <w:r>
         <w:rPr>
@@ -1635,27 +1588,7 @@
           <w:sz w:val="21"/>
           <w:szCs w:val="21"/>
         </w:rPr>
-        <w:t xml:space="preserve"> | </w:t>
-      </w:r>
-      <w:proofErr w:type="spellStart"/>
-      <w:r>
-        <w:rPr>
-          <w:rFonts w:ascii="Calibri" w:eastAsia="Calibri" w:hAnsi="Calibri" w:cs="Calibri"/>
-          <w:color w:val="1F3864"/>
-          <w:sz w:val="21"/>
-          <w:szCs w:val="21"/>
-        </w:rPr>
-        <w:t>Magendhiran</w:t>
-      </w:r>
-      <w:proofErr w:type="spellEnd"/>
-      <w:r>
-        <w:rPr>
-          <w:rFonts w:ascii="Calibri" w:eastAsia="Calibri" w:hAnsi="Calibri" w:cs="Calibri"/>
-          <w:color w:val="1F3864"/>
-          <w:sz w:val="21"/>
-          <w:szCs w:val="21"/>
-        </w:rPr>
-        <w:t xml:space="preserve"> Consultancy Services</w:t>
+        <w:t xml:space="preserve"> | Job Seekers - Jordan, USA, India / Amazon</w:t>
       </w:r>
       <w:r>
         <w:rPr>
@@ -1667,93 +1600,47 @@
           <w:szCs w:val="19"/>
         </w:rPr>
         <w:tab/>
-        <w:t>Mar 2019 - May 2020</w:t>
-      </w:r>
-    </w:p>
-    <w:p>
-      <w:pPr>
-        <w:pStyle w:val="ListParagraph"/>
-        <w:numPr>
-          <w:ilvl w:val="0"/>
-          <w:numId w:val="2"/>
-        </w:numPr>
-        <w:jc w:val="both"/>
-        <w:rPr>
-          <w:rFonts w:ascii="Calibri" w:hAnsi="Calibri" w:cs="Calibri"/>
-        </w:rPr>
-      </w:pPr>
-      <w:r>
-        <w:rPr>
-          <w:rFonts w:ascii="Calibri" w:eastAsia="Calibri" w:hAnsi="Calibri" w:cs="Calibri"/>
-          <w:color w:val="222222"/>
-        </w:rPr>
-        <w:t xml:space="preserve">Implemented REST APIs using Spring Boot with method-level metrics via Spring AOP and Actuator; integrated </w:t>
-      </w:r>
-      <w:proofErr w:type="spellStart"/>
-      <w:r>
-        <w:rPr>
-          <w:rFonts w:ascii="Calibri" w:eastAsia="Calibri" w:hAnsi="Calibri" w:cs="Calibri"/>
-          <w:color w:val="222222"/>
-        </w:rPr>
-        <w:t>Zipkin</w:t>
-      </w:r>
-      <w:proofErr w:type="spellEnd"/>
-      <w:r>
-        <w:rPr>
-          <w:rFonts w:ascii="Calibri" w:eastAsia="Calibri" w:hAnsi="Calibri" w:cs="Calibri"/>
-          <w:color w:val="222222"/>
-        </w:rPr>
-        <w:t xml:space="preserve"> for distributed monitoring and </w:t>
-      </w:r>
-      <w:proofErr w:type="spellStart"/>
-      <w:r>
-        <w:rPr>
-          <w:rFonts w:ascii="Calibri" w:eastAsia="Calibri" w:hAnsi="Calibri" w:cs="Calibri"/>
-          <w:color w:val="222222"/>
-        </w:rPr>
-        <w:t>Hystrix</w:t>
-      </w:r>
-      <w:proofErr w:type="spellEnd"/>
-      <w:r>
-        <w:rPr>
-          <w:rFonts w:ascii="Calibri" w:eastAsia="Calibri" w:hAnsi="Calibri" w:cs="Calibri"/>
-          <w:color w:val="222222"/>
-        </w:rPr>
-        <w:t xml:space="preserve"> for fault tolerance.</w:t>
-      </w:r>
-    </w:p>
-    <w:p>
-      <w:pPr>
-        <w:pStyle w:val="ListParagraph"/>
-        <w:numPr>
-          <w:ilvl w:val="0"/>
-          <w:numId w:val="2"/>
-        </w:numPr>
-        <w:jc w:val="both"/>
-        <w:rPr>
-          <w:rFonts w:ascii="Calibri" w:hAnsi="Calibri" w:cs="Calibri"/>
-        </w:rPr>
-      </w:pPr>
-      <w:r>
-        <w:rPr>
-          <w:rFonts w:ascii="Calibri" w:eastAsia="Calibri" w:hAnsi="Calibri" w:cs="Calibri"/>
-          <w:color w:val="222222"/>
-        </w:rPr>
-        <w:t xml:space="preserve">Built AngularJS 1.x controller, service, and directive code for a CIM UI conversion proof of concept; used Spring Config Server and Splunk for </w:t>
-      </w:r>
-      <w:r>
-        <w:rPr>
-          <w:rFonts w:ascii="Calibri" w:eastAsia="Calibri" w:hAnsi="Calibri" w:cs="Calibri"/>
-          <w:color w:val="222222"/>
-        </w:rPr>
-        <w:t>centralised</w:t>
-      </w:r>
-      <w:r>
-        <w:rPr>
-          <w:rFonts w:ascii="Calibri" w:eastAsia="Calibri" w:hAnsi="Calibri" w:cs="Calibri"/>
-          <w:color w:val="222222"/>
-        </w:rPr>
-        <w:t xml:space="preserve"> configuration and logging.</w:t>
+        <w:t>Mar 2020 - Mar 2021</w:t>
+      </w:r>
+    </w:p>
+    <w:p>
+      <w:pPr>
+        <w:pStyle w:val="ListParagraph"/>
+        <w:numPr>
+          <w:ilvl w:val="0"/>
+          <w:numId w:val="2"/>
+        </w:numPr>
+        <w:jc w:val="both"/>
+        <w:rPr>
+          <w:rFonts w:ascii="Calibri" w:hAnsi="Calibri" w:cs="Calibri"/>
+        </w:rPr>
+      </w:pPr>
+      <w:r>
+        <w:rPr>
+          <w:rFonts w:ascii="Calibri" w:eastAsia="Calibri" w:hAnsi="Calibri" w:cs="Calibri"/>
+          <w:color w:val="222222"/>
+        </w:rPr>
+        <w:t>Delivered 8 months of international training in Angular, React, MySQL, Oracle, PostgreSQL, Python, Selenium, Cucumber, and JUnit for global learners.</w:t>
+      </w:r>
+    </w:p>
+    <w:p>
+      <w:pPr>
+        <w:pStyle w:val="ListParagraph"/>
+        <w:numPr>
+          <w:ilvl w:val="0"/>
+          <w:numId w:val="2"/>
+        </w:numPr>
+        <w:jc w:val="both"/>
+        <w:rPr>
+          <w:rFonts w:ascii="Calibri" w:hAnsi="Calibri" w:cs="Calibri"/>
+        </w:rPr>
+      </w:pPr>
+      <w:r>
+        <w:rPr>
+          <w:rFonts w:ascii="Calibri" w:eastAsia="Calibri" w:hAnsi="Calibri" w:cs="Calibri"/>
+          <w:color w:val="222222"/>
+        </w:rPr>
+        <w:t>Trained Amazon software developers in the USA on Java, Selenium, Cucumber, and Mockito over a 45-day engagement.</w:t>
       </w:r>
     </w:p>
     <w:p>
@@ -1775,7 +1662,7 @@
           <w:sz w:val="21"/>
           <w:szCs w:val="21"/>
         </w:rPr>
-        <w:t>Java Developer</w:t>
+        <w:t>Corporate Trainer</w:t>
       </w:r>
       <w:r>
         <w:rPr>
@@ -1784,27 +1671,7 @@
           <w:sz w:val="21"/>
           <w:szCs w:val="21"/>
         </w:rPr>
-        <w:t xml:space="preserve"> | </w:t>
-      </w:r>
-      <w:proofErr w:type="spellStart"/>
-      <w:r>
-        <w:rPr>
-          <w:rFonts w:ascii="Calibri" w:eastAsia="Calibri" w:hAnsi="Calibri" w:cs="Calibri"/>
-          <w:color w:val="1F3864"/>
-          <w:sz w:val="21"/>
-          <w:szCs w:val="21"/>
-        </w:rPr>
-        <w:t>Magendhiran</w:t>
-      </w:r>
-      <w:proofErr w:type="spellEnd"/>
-      <w:r>
-        <w:rPr>
-          <w:rFonts w:ascii="Calibri" w:eastAsia="Calibri" w:hAnsi="Calibri" w:cs="Calibri"/>
-          <w:color w:val="1F3864"/>
-          <w:sz w:val="21"/>
-          <w:szCs w:val="21"/>
-        </w:rPr>
-        <w:t xml:space="preserve"> Consultancy Services </w:t>
+        <w:t xml:space="preserve"> | TEC Consultancy Services, Chennai</w:t>
       </w:r>
       <w:r>
         <w:rPr>
@@ -1816,7 +1683,116 @@
           <w:szCs w:val="19"/>
         </w:rPr>
         <w:tab/>
-        <w:t xml:space="preserve">Aug 2017 - </w:t>
+        <w:t>Apr 2005 - May 2006</w:t>
+      </w:r>
+    </w:p>
+    <w:p>
+      <w:pPr>
+        <w:pStyle w:val="ListParagraph"/>
+        <w:numPr>
+          <w:ilvl w:val="0"/>
+          <w:numId w:val="2"/>
+        </w:numPr>
+        <w:jc w:val="both"/>
+        <w:rPr>
+          <w:rFonts w:ascii="Calibri" w:hAnsi="Calibri" w:cs="Calibri"/>
+        </w:rPr>
+      </w:pPr>
+      <w:r>
+        <w:rPr>
+          <w:rFonts w:ascii="Calibri" w:eastAsia="Calibri" w:hAnsi="Calibri" w:cs="Calibri"/>
+          <w:color w:val="222222"/>
+        </w:rPr>
+        <w:t>Delivered programming languages, core concepts, and database training across multiple corporate batches over one year.</w:t>
+      </w:r>
+    </w:p>
+    <w:p>
+      <w:pPr>
+        <w:pBdr>
+          <w:bottom w:val="single" w:sz="4" w:space="2" w:color="1F3864"/>
+        </w:pBdr>
+        <w:jc w:val="both"/>
+        <w:rPr>
+          <w:rFonts w:ascii="Calibri" w:eastAsia="Calibri" w:hAnsi="Calibri" w:cs="Calibri"/>
+          <w:b/>
+          <w:bCs/>
+          <w:color w:val="1F3864"/>
+          <w:sz w:val="22"/>
+          <w:szCs w:val="22"/>
+        </w:rPr>
+      </w:pPr>
+    </w:p>
+    <w:p>
+      <w:pPr>
+        <w:pBdr>
+          <w:bottom w:val="single" w:sz="4" w:space="2" w:color="1F3864"/>
+        </w:pBdr>
+        <w:jc w:val="both"/>
+        <w:rPr>
+          <w:rFonts w:ascii="Calibri" w:hAnsi="Calibri" w:cs="Calibri"/>
+        </w:rPr>
+      </w:pPr>
+      <w:r>
+        <w:rPr>
+          <w:rFonts w:ascii="Calibri" w:eastAsia="Calibri" w:hAnsi="Calibri" w:cs="Calibri"/>
+          <w:b/>
+          <w:bCs/>
+          <w:color w:val="1F3864"/>
+          <w:sz w:val="22"/>
+          <w:szCs w:val="22"/>
+        </w:rPr>
+        <w:t>PROFESSIONAL DEVELOPMENT EXPERIENCE</w:t>
+      </w:r>
+    </w:p>
+    <w:p>
+      <w:pPr>
+        <w:tabs>
+          <w:tab w:val="right" w:pos="9350"/>
+        </w:tabs>
+        <w:jc w:val="both"/>
+        <w:rPr>
+          <w:rFonts w:ascii="Calibri" w:hAnsi="Calibri" w:cs="Calibri"/>
+        </w:rPr>
+      </w:pPr>
+      <w:r>
+        <w:rPr>
+          <w:rFonts w:ascii="Calibri" w:eastAsia="Calibri" w:hAnsi="Calibri" w:cs="Calibri"/>
+          <w:b/>
+          <w:bCs/>
+          <w:color w:val="222222"/>
+          <w:sz w:val="21"/>
+          <w:szCs w:val="21"/>
+        </w:rPr>
+        <w:t>Senior Java Developer</w:t>
+      </w:r>
+      <w:r>
+        <w:rPr>
+          <w:rFonts w:ascii="Calibri" w:eastAsia="Calibri" w:hAnsi="Calibri" w:cs="Calibri"/>
+          <w:color w:val="1F3864"/>
+          <w:sz w:val="21"/>
+          <w:szCs w:val="21"/>
+        </w:rPr>
+        <w:t xml:space="preserve"> | </w:t>
+      </w:r>
+      <w:proofErr w:type="spellStart"/>
+      <w:r>
+        <w:rPr>
+          <w:rFonts w:ascii="Calibri" w:eastAsia="Calibri" w:hAnsi="Calibri" w:cs="Calibri"/>
+          <w:color w:val="1F3864"/>
+          <w:sz w:val="21"/>
+          <w:szCs w:val="21"/>
+        </w:rPr>
+        <w:t>Magendhiran</w:t>
+      </w:r>
+      <w:proofErr w:type="spellEnd"/>
+      <w:r>
+        <w:rPr>
+          <w:rFonts w:ascii="Calibri" w:eastAsia="Calibri" w:hAnsi="Calibri" w:cs="Calibri"/>
+          <w:color w:val="1F3864"/>
+          <w:sz w:val="21"/>
+          <w:szCs w:val="21"/>
+        </w:rPr>
+        <w:t xml:space="preserve"> Consultancy Services</w:t>
       </w:r>
       <w:r>
         <w:rPr>
@@ -1827,6 +1803,167 @@
           <w:sz w:val="19"/>
           <w:szCs w:val="19"/>
         </w:rPr>
+        <w:tab/>
+        <w:t>Mar 2019 - May 2020</w:t>
+      </w:r>
+    </w:p>
+    <w:p>
+      <w:pPr>
+        <w:pStyle w:val="ListParagraph"/>
+        <w:numPr>
+          <w:ilvl w:val="0"/>
+          <w:numId w:val="2"/>
+        </w:numPr>
+        <w:jc w:val="both"/>
+        <w:rPr>
+          <w:rFonts w:ascii="Calibri" w:hAnsi="Calibri" w:cs="Calibri"/>
+        </w:rPr>
+      </w:pPr>
+      <w:r>
+        <w:rPr>
+          <w:rFonts w:ascii="Calibri" w:eastAsia="Calibri" w:hAnsi="Calibri" w:cs="Calibri"/>
+          <w:color w:val="222222"/>
+        </w:rPr>
+        <w:t xml:space="preserve">Implemented REST APIs using Spring Boot with method-level metrics via Spring AOP and Actuator; integrated </w:t>
+      </w:r>
+      <w:proofErr w:type="spellStart"/>
+      <w:r>
+        <w:rPr>
+          <w:rFonts w:ascii="Calibri" w:eastAsia="Calibri" w:hAnsi="Calibri" w:cs="Calibri"/>
+          <w:color w:val="222222"/>
+        </w:rPr>
+        <w:t>Zipkin</w:t>
+      </w:r>
+      <w:proofErr w:type="spellEnd"/>
+      <w:r>
+        <w:rPr>
+          <w:rFonts w:ascii="Calibri" w:eastAsia="Calibri" w:hAnsi="Calibri" w:cs="Calibri"/>
+          <w:color w:val="222222"/>
+        </w:rPr>
+        <w:t xml:space="preserve"> for distributed monitoring and </w:t>
+      </w:r>
+      <w:proofErr w:type="spellStart"/>
+      <w:r>
+        <w:rPr>
+          <w:rFonts w:ascii="Calibri" w:eastAsia="Calibri" w:hAnsi="Calibri" w:cs="Calibri"/>
+          <w:color w:val="222222"/>
+        </w:rPr>
+        <w:t>Hystrix</w:t>
+      </w:r>
+      <w:proofErr w:type="spellEnd"/>
+      <w:r>
+        <w:rPr>
+          <w:rFonts w:ascii="Calibri" w:eastAsia="Calibri" w:hAnsi="Calibri" w:cs="Calibri"/>
+          <w:color w:val="222222"/>
+        </w:rPr>
+        <w:t xml:space="preserve"> for fault tolerance.</w:t>
+      </w:r>
+    </w:p>
+    <w:p>
+      <w:pPr>
+        <w:pStyle w:val="ListParagraph"/>
+        <w:numPr>
+          <w:ilvl w:val="0"/>
+          <w:numId w:val="2"/>
+        </w:numPr>
+        <w:jc w:val="both"/>
+        <w:rPr>
+          <w:rFonts w:ascii="Calibri" w:hAnsi="Calibri" w:cs="Calibri"/>
+        </w:rPr>
+      </w:pPr>
+      <w:r>
+        <w:rPr>
+          <w:rFonts w:ascii="Calibri" w:eastAsia="Calibri" w:hAnsi="Calibri" w:cs="Calibri"/>
+          <w:color w:val="222222"/>
+        </w:rPr>
+        <w:t xml:space="preserve">Built AngularJS 1.x controller, service, and directive code for a CIM UI conversion proof of concept; used Spring Config Server and Splunk for </w:t>
+      </w:r>
+      <w:r>
+        <w:rPr>
+          <w:rFonts w:ascii="Calibri" w:eastAsia="Calibri" w:hAnsi="Calibri" w:cs="Calibri"/>
+          <w:color w:val="222222"/>
+        </w:rPr>
+        <w:t>centralised</w:t>
+      </w:r>
+      <w:r>
+        <w:rPr>
+          <w:rFonts w:ascii="Calibri" w:eastAsia="Calibri" w:hAnsi="Calibri" w:cs="Calibri"/>
+          <w:color w:val="222222"/>
+        </w:rPr>
+        <w:t xml:space="preserve"> configuration and logging.</w:t>
+      </w:r>
+    </w:p>
+    <w:p>
+      <w:pPr>
+        <w:tabs>
+          <w:tab w:val="right" w:pos="9350"/>
+        </w:tabs>
+        <w:jc w:val="both"/>
+        <w:rPr>
+          <w:rFonts w:ascii="Calibri" w:hAnsi="Calibri" w:cs="Calibri"/>
+        </w:rPr>
+      </w:pPr>
+      <w:r>
+        <w:rPr>
+          <w:rFonts w:ascii="Calibri" w:eastAsia="Calibri" w:hAnsi="Calibri" w:cs="Calibri"/>
+          <w:b/>
+          <w:bCs/>
+          <w:color w:val="222222"/>
+          <w:sz w:val="21"/>
+          <w:szCs w:val="21"/>
+        </w:rPr>
+        <w:t>Java Developer</w:t>
+      </w:r>
+      <w:r>
+        <w:rPr>
+          <w:rFonts w:ascii="Calibri" w:eastAsia="Calibri" w:hAnsi="Calibri" w:cs="Calibri"/>
+          <w:color w:val="1F3864"/>
+          <w:sz w:val="21"/>
+          <w:szCs w:val="21"/>
+        </w:rPr>
+        <w:t xml:space="preserve"> | </w:t>
+      </w:r>
+      <w:proofErr w:type="spellStart"/>
+      <w:r>
+        <w:rPr>
+          <w:rFonts w:ascii="Calibri" w:eastAsia="Calibri" w:hAnsi="Calibri" w:cs="Calibri"/>
+          <w:color w:val="1F3864"/>
+          <w:sz w:val="21"/>
+          <w:szCs w:val="21"/>
+        </w:rPr>
+        <w:t>Magendhiran</w:t>
+      </w:r>
+      <w:proofErr w:type="spellEnd"/>
+      <w:r>
+        <w:rPr>
+          <w:rFonts w:ascii="Calibri" w:eastAsia="Calibri" w:hAnsi="Calibri" w:cs="Calibri"/>
+          <w:color w:val="1F3864"/>
+          <w:sz w:val="21"/>
+          <w:szCs w:val="21"/>
+        </w:rPr>
+        <w:t xml:space="preserve"> Consultancy Services </w:t>
+      </w:r>
+      <w:r>
+        <w:rPr>
+          <w:rFonts w:ascii="Calibri" w:eastAsia="Calibri" w:hAnsi="Calibri" w:cs="Calibri"/>
+          <w:i/>
+          <w:iCs/>
+          <w:color w:val="555555"/>
+          <w:sz w:val="19"/>
+          <w:szCs w:val="19"/>
+        </w:rPr>
+        <w:tab/>
+        <w:t xml:space="preserve">Aug 2017 - </w:t>
+      </w:r>
+      <w:r>
+        <w:rPr>
+          <w:rFonts w:ascii="Calibri" w:eastAsia="Calibri" w:hAnsi="Calibri" w:cs="Calibri"/>
+          <w:i/>
+          <w:iCs/>
+          <w:color w:val="555555"/>
+          <w:sz w:val="19"/>
+          <w:szCs w:val="19"/>
+        </w:rPr>
         <w:t xml:space="preserve">Apr 2014 </w:t>
       </w:r>
     </w:p>
@@ -2508,7 +2645,7 @@
     </w:p>
     <w:sectPr>
       <w:pgSz w:w="12240" w:h="15840"/>
-      <w:pgMar w:top="720" w:right="900" w:bottom="720" w:left="900" w:header="708" w:footer="708" w:gutter="0"/>
+      <w:pgMar w:top="720" w:right="900" w:bottom="426" w:left="900" w:header="708" w:footer="708" w:gutter="0"/>
       <w:cols w:space="720"/>
       <w:docGrid w:linePitch="360"/>
     </w:sectPr>
@@ -2658,6 +2795,119 @@
       <w:lvlJc w:val="left"/>
     </w:lvl>
   </w:abstractNum>
+  <w:abstractNum w:abstractNumId="2" w15:restartNumberingAfterBreak="0">
+    <w:nsid w:val="53361406"/>
+    <w:multiLevelType w:val="hybridMultilevel"/>
+    <w:tmpl w:val="B07AA714"/>
+    <w:lvl w:ilvl="0" w:tplc="40090001">
+      <w:start w:val="1"/>
+      <w:numFmt w:val="bullet"/>
+      <w:lvlText w:val=""/>
+      <w:lvlJc w:val="left"/>
+      <w:pPr>
+        <w:ind w:left="502" w:hanging="360"/>
+      </w:pPr>
+      <w:rPr>
+        <w:rFonts w:ascii="Symbol" w:hAnsi="Symbol" w:hint="default"/>
+      </w:rPr>
+    </w:lvl>
+    <w:lvl w:ilvl="1" w:tplc="40090003" w:tentative="1">
+      <w:start w:val="1"/>
+      <w:numFmt w:val="bullet"/>
+      <w:lvlText w:val="o"/>
+      <w:lvlJc w:val="left"/>
+      <w:pPr>
+        <w:ind w:left="1222" w:hanging="360"/>
+      </w:pPr>
+      <w:rPr>
+        <w:rFonts w:ascii="Courier New" w:hAnsi="Courier New" w:cs="Courier New" w:hint="default"/>
+      </w:rPr>
+    </w:lvl>
+    <w:lvl w:ilvl="2" w:tplc="40090005" w:tentative="1">
+      <w:start w:val="1"/>
+      <w:numFmt w:val="bullet"/>
+      <w:lvlText w:val=""/>
+      <w:lvlJc w:val="left"/>
+      <w:pPr>
+        <w:ind w:left="1942" w:hanging="360"/>
+      </w:pPr>
+      <w:rPr>
+        <w:rFonts w:ascii="Wingdings" w:hAnsi="Wingdings" w:hint="default"/>
+      </w:rPr>
+    </w:lvl>
+    <w:lvl w:ilvl="3" w:tplc="40090001" w:tentative="1">
+      <w:start w:val="1"/>
+      <w:numFmt w:val="bullet"/>
+      <w:lvlText w:val=""/>
+      <w:lvlJc w:val="left"/>
+      <w:pPr>
+        <w:ind w:left="2662" w:hanging="360"/>
+      </w:pPr>
+      <w:rPr>
+        <w:rFonts w:ascii="Symbol" w:hAnsi="Symbol" w:hint="default"/>
+      </w:rPr>
+    </w:lvl>
+    <w:lvl w:ilvl="4" w:tplc="40090003" w:tentative="1">
+      <w:start w:val="1"/>
+      <w:numFmt w:val="bullet"/>
+      <w:lvlText w:val="o"/>
+      <w:lvlJc w:val="left"/>
+      <w:pPr>
+        <w:ind w:left="3382" w:hanging="360"/>
+      </w:pPr>
+      <w:rPr>
+        <w:rFonts w:ascii="Courier New" w:hAnsi="Courier New" w:cs="Courier New" w:hint="default"/>
+      </w:rPr>
+    </w:lvl>
+    <w:lvl w:ilvl="5" w:tplc="40090005" w:tentative="1">
+      <w:start w:val="1"/>
+      <w:numFmt w:val="bullet"/>
+      <w:lvlText w:val=""/>
+      <w:lvlJc w:val="left"/>
+      <w:pPr>
+        <w:ind w:left="4102" w:hanging="360"/>
+      </w:pPr>
+      <w:rPr>
+        <w:rFonts w:ascii="Wingdings" w:hAnsi="Wingdings" w:hint="default"/>
+      </w:rPr>
+    </w:lvl>
+    <w:lvl w:ilvl="6" w:tplc="40090001" w:tentative="1">
+      <w:start w:val="1"/>
+      <w:numFmt w:val="bullet"/>
+      <w:lvlText w:val=""/>
+      <w:lvlJc w:val="left"/>
+      <w:pPr>
+        <w:ind w:left="4822" w:hanging="360"/>
+      </w:pPr>
+      <w:rPr>
+        <w:rFonts w:ascii="Symbol" w:hAnsi="Symbol" w:hint="default"/>
+      </w:rPr>
+    </w:lvl>
+    <w:lvl w:ilvl="7" w:tplc="40090003" w:tentative="1">
+      <w:start w:val="1"/>
+      <w:numFmt w:val="bullet"/>
+      <w:lvlText w:val="o"/>
+      <w:lvlJc w:val="left"/>
+      <w:pPr>
+        <w:ind w:left="5542" w:hanging="360"/>
+      </w:pPr>
+      <w:rPr>
+        <w:rFonts w:ascii="Courier New" w:hAnsi="Courier New" w:cs="Courier New" w:hint="default"/>
+      </w:rPr>
+    </w:lvl>
+    <w:lvl w:ilvl="8" w:tplc="40090005" w:tentative="1">
+      <w:start w:val="1"/>
+      <w:numFmt w:val="bullet"/>
+      <w:lvlText w:val=""/>
+      <w:lvlJc w:val="left"/>
+      <w:pPr>
+        <w:ind w:left="6262" w:hanging="360"/>
+      </w:pPr>
+      <w:rPr>
+        <w:rFonts w:ascii="Wingdings" w:hAnsi="Wingdings" w:hint="default"/>
+      </w:rPr>
+    </w:lvl>
+  </w:abstractNum>
   <w:num w:numId="1">
     <w:abstractNumId w:val="0"/>
     <w:lvlOverride w:ilvl="0">
@@ -2669,6 +2919,9 @@
     <w:lvlOverride w:ilvl="0">
       <w:startOverride w:val="1"/>
     </w:lvlOverride>
+  </w:num>
+  <w:num w:numId="3">
+    <w:abstractNumId w:val="2"/>
   </w:num>
 </w:numbering>
 </file>

</xml_diff>